<commit_message>
editing appendix C tables
</commit_message>
<xml_diff>
--- a/Report Draft/Appendix-C-Methodology-Tables.docx
+++ b/Report Draft/Appendix-C-Methodology-Tables.docx
@@ -3569,7 +3569,7 @@
         <w:pStyle w:val="Caption"/>
       </w:pPr>
       <w:r>
-        <w:t>Table C.3  Hyperparameters: meaning, candidates, selection and expected effect. Selected values are reported in Chapter 4, being outcomes of the procedure.</w:t>
+        <w:t xml:space="preserve">Table C.3  Hyperparameters: meaning, candidates, selection and expected effect. Selected values are reported in Chapter 4, being outcomes of the procedure. The three swept quantities give eighteen configurations; their ranges bracket what they control — the lookback grid spans HAR-RV's twenty-two-day reach, the width grid the capacity a sample of this size can identify, and the two learning rates the conventional range for this optimiser.</w:t>
       </w:r>
     </w:p>
     <w:tbl>
@@ -3880,7 +3880,7 @@
                 <w:sz w:val="17"/>
                 <w:szCs w:val="17"/>
               </w:rPr>
-              <w:t xml:space="preserve">3 values, 10–40</w:t>
+              <w:t xml:space="preserve">10, 20, 40</w:t>
             </w:r>
           </w:p>
         </w:tc>
@@ -3913,7 +3913,7 @@
                 <w:sz w:val="17"/>
                 <w:szCs w:val="17"/>
               </w:rPr>
-              <w:t xml:space="preserve">Grid, validation loss</w:t>
+              <w:t xml:space="preserve">Grid, validation QLIKE</w:t>
             </w:r>
           </w:p>
         </w:tc>
@@ -4051,7 +4051,7 @@
                 <w:sz w:val="17"/>
                 <w:szCs w:val="17"/>
               </w:rPr>
-              <w:t xml:space="preserve">3 values, 32–128</w:t>
+              <w:t xml:space="preserve">32, 64, 128</w:t>
             </w:r>
           </w:p>
         </w:tc>
@@ -4084,7 +4084,7 @@
                 <w:sz w:val="17"/>
                 <w:szCs w:val="17"/>
               </w:rPr>
-              <w:t xml:space="preserve">Grid, validation loss</w:t>
+              <w:t xml:space="preserve">Grid, validation QLIKE</w:t>
             </w:r>
           </w:p>
         </w:tc>
@@ -4222,7 +4222,7 @@
                 <w:sz w:val="17"/>
                 <w:szCs w:val="17"/>
               </w:rPr>
-              <w:t xml:space="preserve">2 values, 1e-4 to 1e-3</w:t>
+              <w:t xml:space="preserve">1e-3, 1e-4</w:t>
             </w:r>
           </w:p>
         </w:tc>
@@ -4255,7 +4255,7 @@
                 <w:sz w:val="17"/>
                 <w:szCs w:val="17"/>
               </w:rPr>
-              <w:t xml:space="preserve">Grid, validation loss</w:t>
+              <w:t xml:space="preserve">Grid, validation QLIKE</w:t>
             </w:r>
           </w:p>
         </w:tc>
@@ -6990,7 +6990,7 @@
                 <w:sz w:val="18"/>
                 <w:szCs w:val="18"/>
               </w:rPr>
-              <w:t>Single precision; a few megabytes at any width in the Appendix C.3 grid</w:t>
+              <w:t xml:space="preserve">Single precision; under a megabyte at any width in the Appendix C.3 grid</w:t>
             </w:r>
           </w:p>
         </w:tc>
@@ -7134,7 +7134,7 @@
                 <w:sz w:val="18"/>
                 <w:szCs w:val="18"/>
               </w:rPr>
-              <w:t xml:space="preserve">Accelerator</w:t>
+              <w:t xml:space="preserve">Working memory</w:t>
             </w:r>
           </w:p>
         </w:tc>
@@ -7167,7 +7167,7 @@
                 <w:sz w:val="18"/>
                 <w:szCs w:val="18"/>
               </w:rPr>
-              <w:t xml:space="preserve">None</w:t>
+              <w:t xml:space="preserve">Under 512 MB</w:t>
             </w:r>
           </w:p>
         </w:tc>
@@ -7200,7 +7200,7 @@
                 <w:sz w:val="18"/>
                 <w:szCs w:val="18"/>
               </w:rPr>
-              <w:t xml:space="preserve">CPU throughout</w:t>
+              <w:t xml:space="preserve">The deep-learning framework's own footprint dominates; parameters and data together are under two megabytes. Chapter 4 reports the measured peak</w:t>
             </w:r>
           </w:p>
         </w:tc>
@@ -7239,7 +7239,7 @@
                 <w:sz w:val="18"/>
                 <w:szCs w:val="18"/>
               </w:rPr>
-              <w:t xml:space="preserve">End-to-end runtime</w:t>
+              <w:t xml:space="preserve">Accelerator</w:t>
             </w:r>
           </w:p>
         </w:tc>
@@ -7272,7 +7272,7 @@
                 <w:sz w:val="18"/>
                 <w:szCs w:val="18"/>
               </w:rPr>
-              <w:t>Minutes rather than hours on the configuration above</w:t>
+              <w:t xml:space="preserve">None</w:t>
             </w:r>
           </w:p>
         </w:tc>
@@ -7305,7 +7305,7 @@
                 <w:sz w:val="18"/>
                 <w:szCs w:val="18"/>
               </w:rPr>
-              <w:t>Chapter 4 reports the measured wall-clock, hyperparameter search included</w:t>
+              <w:t xml:space="preserve">CPU throughout</w:t>
             </w:r>
           </w:p>
         </w:tc>
@@ -7344,6 +7344,111 @@
                 <w:sz w:val="18"/>
                 <w:szCs w:val="18"/>
               </w:rPr>
+              <w:t xml:space="preserve">End-to-end runtime</w:t>
+            </w:r>
+          </w:p>
+        </w:tc>
+        <w:tc>
+          <w:tcPr>
+            <w:tcW w:type="dxa" w:w="2200"/>
+            <w:tcBorders>
+              <w:top w:val="none" w:color="FFFFFF" w:sz="0"/>
+              <w:left w:val="none" w:color="FFFFFF" w:sz="0"/>
+              <w:bottom w:val="single" w:color="BFBFBF" w:sz="4"/>
+              <w:right w:val="none" w:color="FFFFFF" w:sz="0"/>
+            </w:tcBorders>
+            <w:tcMar>
+              <w:top w:type="dxa" w:w="70"/>
+              <w:left w:type="dxa" w:w="110"/>
+              <w:bottom w:type="dxa" w:w="70"/>
+              <w:right w:type="dxa" w:w="110"/>
+            </w:tcMar>
+          </w:tcPr>
+          <w:p>
+            <w:pPr>
+              <w:spacing w:after="0" w:line="260"/>
+            </w:pPr>
+            <w:r>
+              <w:rPr>
+                <w:rFonts w:ascii="Calibri" w:cs="Calibri" w:eastAsia="Calibri" w:hAnsi="Calibri"/>
+                <w:b w:val="false"/>
+                <w:bCs w:val="false"/>
+                <w:color w:val="444444"/>
+                <w:sz w:val="18"/>
+                <w:szCs w:val="18"/>
+              </w:rPr>
+              <w:t>Minutes rather than hours on the configuration above</w:t>
+            </w:r>
+          </w:p>
+        </w:tc>
+        <w:tc>
+          <w:tcPr>
+            <w:tcW w:type="dxa" w:w="4826"/>
+            <w:tcBorders>
+              <w:top w:val="none" w:color="FFFFFF" w:sz="0"/>
+              <w:left w:val="none" w:color="FFFFFF" w:sz="0"/>
+              <w:bottom w:val="single" w:color="BFBFBF" w:sz="4"/>
+              <w:right w:val="none" w:color="FFFFFF" w:sz="0"/>
+            </w:tcBorders>
+            <w:tcMar>
+              <w:top w:type="dxa" w:w="70"/>
+              <w:left w:type="dxa" w:w="110"/>
+              <w:bottom w:type="dxa" w:w="70"/>
+              <w:right w:type="dxa" w:w="110"/>
+            </w:tcMar>
+          </w:tcPr>
+          <w:p>
+            <w:pPr>
+              <w:spacing w:after="0" w:line="260"/>
+            </w:pPr>
+            <w:r>
+              <w:rPr>
+                <w:rFonts w:ascii="Calibri" w:cs="Calibri" w:eastAsia="Calibri" w:hAnsi="Calibri"/>
+                <w:b w:val="false"/>
+                <w:bCs w:val="false"/>
+                <w:color w:val="444444"/>
+                <w:sz w:val="18"/>
+                <w:szCs w:val="18"/>
+              </w:rPr>
+              <w:t>Chapter 4 reports the measured wall-clock, hyperparameter search included</w:t>
+            </w:r>
+          </w:p>
+        </w:tc>
+      </w:tr>
+      <w:tr>
+        <w:trPr>
+          <w:cantSplit/>
+          <w:tblHeader w:val="false"/>
+        </w:trPr>
+        <w:tc>
+          <w:tcPr>
+            <w:tcW w:type="dxa" w:w="2000"/>
+            <w:tcBorders>
+              <w:top w:val="none" w:color="FFFFFF" w:sz="0"/>
+              <w:left w:val="none" w:color="FFFFFF" w:sz="0"/>
+              <w:bottom w:val="single" w:color="BFBFBF" w:sz="4"/>
+              <w:right w:val="none" w:color="FFFFFF" w:sz="0"/>
+            </w:tcBorders>
+            <w:tcMar>
+              <w:top w:type="dxa" w:w="70"/>
+              <w:left w:type="dxa" w:w="110"/>
+              <w:bottom w:type="dxa" w:w="70"/>
+              <w:right w:type="dxa" w:w="110"/>
+            </w:tcMar>
+          </w:tcPr>
+          <w:p>
+            <w:pPr>
+              <w:spacing w:after="0" w:line="260"/>
+            </w:pPr>
+            <w:r>
+              <w:rPr>
+                <w:rFonts w:ascii="Calibri" w:cs="Calibri" w:eastAsia="Calibri" w:hAnsi="Calibri"/>
+                <w:b w:val="false"/>
+                <w:bCs w:val="false"/>
+                <w:color w:val="444444"/>
+                <w:sz w:val="18"/>
+                <w:szCs w:val="18"/>
+              </w:rPr>
               <w:t xml:space="preserve">Inference</w:t>
             </w:r>
           </w:p>
@@ -7411,6 +7516,426 @@
                 <w:szCs w:val="18"/>
               </w:rPr>
               <w:t xml:space="preserve">The binding cost is input data, not computation</w:t>
+            </w:r>
+          </w:p>
+        </w:tc>
+      </w:tr>
+      <w:tr>
+        <w:trPr>
+          <w:cantSplit/>
+          <w:tblHeader w:val="false"/>
+        </w:trPr>
+        <w:tc>
+          <w:tcPr>
+            <w:tcW w:type="dxa" w:w="2000"/>
+            <w:tcBorders>
+              <w:top w:val="none" w:color="FFFFFF" w:sz="0"/>
+              <w:left w:val="none" w:color="FFFFFF" w:sz="0"/>
+              <w:bottom w:val="single" w:color="BFBFBF" w:sz="4"/>
+              <w:right w:val="none" w:color="FFFFFF" w:sz="0"/>
+            </w:tcBorders>
+            <w:tcMar>
+              <w:top w:type="dxa" w:w="70"/>
+              <w:left w:type="dxa" w:w="110"/>
+              <w:bottom w:type="dxa" w:w="70"/>
+              <w:right w:type="dxa" w:w="110"/>
+            </w:tcMar>
+          </w:tcPr>
+          <w:p>
+            <w:pPr>
+              <w:spacing w:after="0" w:line="260"/>
+            </w:pPr>
+            <w:r>
+              <w:rPr>
+                <w:rFonts w:ascii="Calibri" w:cs="Calibri" w:eastAsia="Calibri" w:hAnsi="Calibri"/>
+                <w:b w:val="false"/>
+                <w:bCs w:val="false"/>
+                <w:color w:val="444444"/>
+                <w:sz w:val="18"/>
+                <w:szCs w:val="18"/>
+              </w:rPr>
+              <w:t xml:space="preserve">Software</w:t>
+            </w:r>
+          </w:p>
+        </w:tc>
+        <w:tc>
+          <w:tcPr>
+            <w:tcW w:type="dxa" w:w="2200"/>
+            <w:tcBorders>
+              <w:top w:val="none" w:color="FFFFFF" w:sz="0"/>
+              <w:left w:val="none" w:color="FFFFFF" w:sz="0"/>
+              <w:bottom w:val="single" w:color="BFBFBF" w:sz="4"/>
+              <w:right w:val="none" w:color="FFFFFF" w:sz="0"/>
+            </w:tcBorders>
+            <w:tcMar>
+              <w:top w:type="dxa" w:w="70"/>
+              <w:left w:type="dxa" w:w="110"/>
+              <w:bottom w:type="dxa" w:w="70"/>
+              <w:right w:type="dxa" w:w="110"/>
+            </w:tcMar>
+          </w:tcPr>
+          <w:p>
+            <w:pPr>
+              <w:spacing w:after="0" w:line="260"/>
+            </w:pPr>
+            <w:r>
+              <w:rPr>
+                <w:rFonts w:ascii="Calibri" w:cs="Calibri" w:eastAsia="Calibri" w:hAnsi="Calibri"/>
+                <w:b w:val="false"/>
+                <w:bCs w:val="false"/>
+                <w:color w:val="444444"/>
+                <w:sz w:val="18"/>
+                <w:szCs w:val="18"/>
+              </w:rPr>
+              <w:t xml:space="preserve">Python 3.12 with the pinned dependency set; no accelerator libraries</w:t>
+            </w:r>
+          </w:p>
+        </w:tc>
+        <w:tc>
+          <w:tcPr>
+            <w:tcW w:type="dxa" w:w="4826"/>
+            <w:tcBorders>
+              <w:top w:val="none" w:color="FFFFFF" w:sz="0"/>
+              <w:left w:val="none" w:color="FFFFFF" w:sz="0"/>
+              <w:bottom w:val="single" w:color="BFBFBF" w:sz="4"/>
+              <w:right w:val="none" w:color="FFFFFF" w:sz="0"/>
+            </w:tcBorders>
+            <w:tcMar>
+              <w:top w:type="dxa" w:w="70"/>
+              <w:left w:type="dxa" w:w="110"/>
+              <w:bottom w:type="dxa" w:w="70"/>
+              <w:right w:type="dxa" w:w="110"/>
+            </w:tcMar>
+          </w:tcPr>
+          <w:p>
+            <w:pPr>
+              <w:spacing w:after="0" w:line="260"/>
+            </w:pPr>
+            <w:r>
+              <w:rPr>
+                <w:rFonts w:ascii="Calibri" w:cs="Calibri" w:eastAsia="Calibri" w:hAnsi="Calibri"/>
+                <w:b w:val="false"/>
+                <w:bCs w:val="false"/>
+                <w:color w:val="444444"/>
+                <w:sz w:val="18"/>
+                <w:szCs w:val="18"/>
+              </w:rPr>
+              <w:t xml:space="preserve">The interpreter version is part of the specification (Section 3.8)</w:t>
+            </w:r>
+          </w:p>
+        </w:tc>
+      </w:tr>
+      <w:tr>
+        <w:trPr>
+          <w:cantSplit/>
+          <w:tblHeader w:val="false"/>
+        </w:trPr>
+        <w:tc>
+          <w:tcPr>
+            <w:tcW w:type="dxa" w:w="2000"/>
+            <w:tcBorders>
+              <w:top w:val="none" w:color="FFFFFF" w:sz="0"/>
+              <w:left w:val="none" w:color="FFFFFF" w:sz="0"/>
+              <w:bottom w:val="single" w:color="BFBFBF" w:sz="4"/>
+              <w:right w:val="none" w:color="FFFFFF" w:sz="0"/>
+            </w:tcBorders>
+            <w:tcMar>
+              <w:top w:type="dxa" w:w="70"/>
+              <w:left w:type="dxa" w:w="110"/>
+              <w:bottom w:type="dxa" w:w="70"/>
+              <w:right w:type="dxa" w:w="110"/>
+            </w:tcMar>
+          </w:tcPr>
+          <w:p>
+            <w:pPr>
+              <w:spacing w:after="0" w:line="260"/>
+            </w:pPr>
+            <w:r>
+              <w:rPr>
+                <w:rFonts w:ascii="Calibri" w:cs="Calibri" w:eastAsia="Calibri" w:hAnsi="Calibri"/>
+                <w:b w:val="false"/>
+                <w:bCs w:val="false"/>
+                <w:color w:val="444444"/>
+                <w:sz w:val="18"/>
+                <w:szCs w:val="18"/>
+              </w:rPr>
+              <w:t xml:space="preserve">Network access</w:t>
+            </w:r>
+          </w:p>
+        </w:tc>
+        <w:tc>
+          <w:tcPr>
+            <w:tcW w:type="dxa" w:w="2200"/>
+            <w:tcBorders>
+              <w:top w:val="none" w:color="FFFFFF" w:sz="0"/>
+              <w:left w:val="none" w:color="FFFFFF" w:sz="0"/>
+              <w:bottom w:val="single" w:color="BFBFBF" w:sz="4"/>
+              <w:right w:val="none" w:color="FFFFFF" w:sz="0"/>
+            </w:tcBorders>
+            <w:tcMar>
+              <w:top w:type="dxa" w:w="70"/>
+              <w:left w:type="dxa" w:w="110"/>
+              <w:bottom w:type="dxa" w:w="70"/>
+              <w:right w:type="dxa" w:w="110"/>
+            </w:tcMar>
+          </w:tcPr>
+          <w:p>
+            <w:pPr>
+              <w:spacing w:after="0" w:line="260"/>
+            </w:pPr>
+            <w:r>
+              <w:rPr>
+                <w:rFonts w:ascii="Calibri" w:cs="Calibri" w:eastAsia="Calibri" w:hAnsi="Calibri"/>
+                <w:b w:val="false"/>
+                <w:bCs w:val="false"/>
+                <w:color w:val="444444"/>
+                <w:sz w:val="18"/>
+                <w:szCs w:val="18"/>
+              </w:rPr>
+              <w:t xml:space="preserve">Once, to acquire and cache the inputs; none thereafter</w:t>
+            </w:r>
+          </w:p>
+        </w:tc>
+        <w:tc>
+          <w:tcPr>
+            <w:tcW w:type="dxa" w:w="4826"/>
+            <w:tcBorders>
+              <w:top w:val="none" w:color="FFFFFF" w:sz="0"/>
+              <w:left w:val="none" w:color="FFFFFF" w:sz="0"/>
+              <w:bottom w:val="single" w:color="BFBFBF" w:sz="4"/>
+              <w:right w:val="none" w:color="FFFFFF" w:sz="0"/>
+            </w:tcBorders>
+            <w:tcMar>
+              <w:top w:type="dxa" w:w="70"/>
+              <w:left w:type="dxa" w:w="110"/>
+              <w:bottom w:type="dxa" w:w="70"/>
+              <w:right w:type="dxa" w:w="110"/>
+            </w:tcMar>
+          </w:tcPr>
+          <w:p>
+            <w:pPr>
+              <w:spacing w:after="0" w:line="260"/>
+            </w:pPr>
+            <w:r>
+              <w:rPr>
+                <w:rFonts w:ascii="Calibri" w:cs="Calibri" w:eastAsia="Calibri" w:hAnsi="Calibri"/>
+                <w:b w:val="false"/>
+                <w:bCs w:val="false"/>
+                <w:color w:val="444444"/>
+                <w:sz w:val="18"/>
+                <w:szCs w:val="18"/>
+              </w:rPr>
+              <w:t xml:space="preserve">A discontinued realised-measure library must be archived, not fetched on demand</w:t>
+            </w:r>
+          </w:p>
+        </w:tc>
+      </w:tr>
+      <w:tr>
+        <w:trPr>
+          <w:cantSplit/>
+          <w:tblHeader w:val="false"/>
+        </w:trPr>
+        <w:tc>
+          <w:tcPr>
+            <w:tcW w:type="dxa" w:w="2000"/>
+            <w:tcBorders>
+              <w:top w:val="none" w:color="FFFFFF" w:sz="0"/>
+              <w:left w:val="none" w:color="FFFFFF" w:sz="0"/>
+              <w:bottom w:val="single" w:color="BFBFBF" w:sz="4"/>
+              <w:right w:val="none" w:color="FFFFFF" w:sz="0"/>
+            </w:tcBorders>
+            <w:tcMar>
+              <w:top w:type="dxa" w:w="70"/>
+              <w:left w:type="dxa" w:w="110"/>
+              <w:bottom w:type="dxa" w:w="70"/>
+              <w:right w:type="dxa" w:w="110"/>
+            </w:tcMar>
+          </w:tcPr>
+          <w:p>
+            <w:pPr>
+              <w:spacing w:after="0" w:line="260"/>
+            </w:pPr>
+            <w:r>
+              <w:rPr>
+                <w:rFonts w:ascii="Calibri" w:cs="Calibri" w:eastAsia="Calibri" w:hAnsi="Calibri"/>
+                <w:b w:val="false"/>
+                <w:bCs w:val="false"/>
+                <w:color w:val="444444"/>
+                <w:sz w:val="18"/>
+                <w:szCs w:val="18"/>
+              </w:rPr>
+              <w:t xml:space="preserve">Storage</w:t>
+            </w:r>
+          </w:p>
+        </w:tc>
+        <w:tc>
+          <w:tcPr>
+            <w:tcW w:type="dxa" w:w="2200"/>
+            <w:tcBorders>
+              <w:top w:val="none" w:color="FFFFFF" w:sz="0"/>
+              <w:left w:val="none" w:color="FFFFFF" w:sz="0"/>
+              <w:bottom w:val="single" w:color="BFBFBF" w:sz="4"/>
+              <w:right w:val="none" w:color="FFFFFF" w:sz="0"/>
+            </w:tcBorders>
+            <w:tcMar>
+              <w:top w:type="dxa" w:w="70"/>
+              <w:left w:type="dxa" w:w="110"/>
+              <w:bottom w:type="dxa" w:w="70"/>
+              <w:right w:type="dxa" w:w="110"/>
+            </w:tcMar>
+          </w:tcPr>
+          <w:p>
+            <w:pPr>
+              <w:spacing w:after="0" w:line="260"/>
+            </w:pPr>
+            <w:r>
+              <w:rPr>
+                <w:rFonts w:ascii="Calibri" w:cs="Calibri" w:eastAsia="Calibri" w:hAnsi="Calibri"/>
+                <w:b w:val="false"/>
+                <w:bCs w:val="false"/>
+                <w:color w:val="444444"/>
+                <w:sz w:val="18"/>
+                <w:szCs w:val="18"/>
+              </w:rPr>
+              <w:t xml:space="preserve">Under 100 MB for the cached inputs and every published artefact</w:t>
+            </w:r>
+          </w:p>
+        </w:tc>
+        <w:tc>
+          <w:tcPr>
+            <w:tcW w:type="dxa" w:w="4826"/>
+            <w:tcBorders>
+              <w:top w:val="none" w:color="FFFFFF" w:sz="0"/>
+              <w:left w:val="none" w:color="FFFFFF" w:sz="0"/>
+              <w:bottom w:val="single" w:color="BFBFBF" w:sz="4"/>
+              <w:right w:val="none" w:color="FFFFFF" w:sz="0"/>
+            </w:tcBorders>
+            <w:tcMar>
+              <w:top w:type="dxa" w:w="70"/>
+              <w:left w:type="dxa" w:w="110"/>
+              <w:bottom w:type="dxa" w:w="70"/>
+              <w:right w:type="dxa" w:w="110"/>
+            </w:tcMar>
+          </w:tcPr>
+          <w:p>
+            <w:pPr>
+              <w:spacing w:after="0" w:line="260"/>
+            </w:pPr>
+            <w:r>
+              <w:rPr>
+                <w:rFonts w:ascii="Calibri" w:cs="Calibri" w:eastAsia="Calibri" w:hAnsi="Calibri"/>
+                <w:b w:val="false"/>
+                <w:bCs w:val="false"/>
+                <w:color w:val="444444"/>
+                <w:sz w:val="18"/>
+                <w:szCs w:val="18"/>
+              </w:rPr>
+              <w:t xml:space="preserve">Dominated by the raw realised-measure file, not by model outputs</w:t>
+            </w:r>
+          </w:p>
+        </w:tc>
+      </w:tr>
+      <w:tr>
+        <w:trPr>
+          <w:cantSplit/>
+          <w:tblHeader w:val="false"/>
+        </w:trPr>
+        <w:tc>
+          <w:tcPr>
+            <w:tcW w:type="dxa" w:w="2000"/>
+            <w:tcBorders>
+              <w:top w:val="none" w:color="FFFFFF" w:sz="0"/>
+              <w:left w:val="none" w:color="FFFFFF" w:sz="0"/>
+              <w:bottom w:val="single" w:color="BFBFBF" w:sz="4"/>
+              <w:right w:val="none" w:color="FFFFFF" w:sz="0"/>
+            </w:tcBorders>
+            <w:tcMar>
+              <w:top w:type="dxa" w:w="70"/>
+              <w:left w:type="dxa" w:w="110"/>
+              <w:bottom w:type="dxa" w:w="70"/>
+              <w:right w:type="dxa" w:w="110"/>
+            </w:tcMar>
+          </w:tcPr>
+          <w:p>
+            <w:pPr>
+              <w:spacing w:after="0" w:line="260"/>
+            </w:pPr>
+            <w:r>
+              <w:rPr>
+                <w:rFonts w:ascii="Calibri" w:cs="Calibri" w:eastAsia="Calibri" w:hAnsi="Calibri"/>
+                <w:b w:val="false"/>
+                <w:bCs w:val="false"/>
+                <w:color w:val="444444"/>
+                <w:sz w:val="18"/>
+                <w:szCs w:val="18"/>
+              </w:rPr>
+              <w:t xml:space="preserve">Availability</w:t>
+            </w:r>
+          </w:p>
+        </w:tc>
+        <w:tc>
+          <w:tcPr>
+            <w:tcW w:type="dxa" w:w="2200"/>
+            <w:tcBorders>
+              <w:top w:val="none" w:color="FFFFFF" w:sz="0"/>
+              <w:left w:val="none" w:color="FFFFFF" w:sz="0"/>
+              <w:bottom w:val="single" w:color="BFBFBF" w:sz="4"/>
+              <w:right w:val="none" w:color="FFFFFF" w:sz="0"/>
+            </w:tcBorders>
+            <w:tcMar>
+              <w:top w:type="dxa" w:w="70"/>
+              <w:left w:type="dxa" w:w="110"/>
+              <w:bottom w:type="dxa" w:w="70"/>
+              <w:right w:type="dxa" w:w="110"/>
+            </w:tcMar>
+          </w:tcPr>
+          <w:p>
+            <w:pPr>
+              <w:spacing w:after="0" w:line="260"/>
+            </w:pPr>
+            <w:r>
+              <w:rPr>
+                <w:rFonts w:ascii="Calibri" w:cs="Calibri" w:eastAsia="Calibri" w:hAnsi="Calibri"/>
+                <w:b w:val="false"/>
+                <w:bCs w:val="false"/>
+                <w:color w:val="444444"/>
+                <w:sz w:val="18"/>
+                <w:szCs w:val="18"/>
+              </w:rPr>
+              <w:t xml:space="preserve">A public repository</w:t>
+            </w:r>
+          </w:p>
+        </w:tc>
+        <w:tc>
+          <w:tcPr>
+            <w:tcW w:type="dxa" w:w="4826"/>
+            <w:tcBorders>
+              <w:top w:val="none" w:color="FFFFFF" w:sz="0"/>
+              <w:left w:val="none" w:color="FFFFFF" w:sz="0"/>
+              <w:bottom w:val="single" w:color="BFBFBF" w:sz="4"/>
+              <w:right w:val="none" w:color="FFFFFF" w:sz="0"/>
+            </w:tcBorders>
+            <w:tcMar>
+              <w:top w:type="dxa" w:w="70"/>
+              <w:left w:type="dxa" w:w="110"/>
+              <w:bottom w:type="dxa" w:w="70"/>
+              <w:right w:type="dxa" w:w="110"/>
+            </w:tcMar>
+          </w:tcPr>
+          <w:p>
+            <w:pPr>
+              <w:spacing w:after="0" w:line="260"/>
+            </w:pPr>
+            <w:r>
+              <w:rPr>
+                <w:rFonts w:ascii="Calibri" w:cs="Calibri" w:eastAsia="Calibri" w:hAnsi="Calibri"/>
+                <w:b w:val="false"/>
+                <w:bCs w:val="false"/>
+                <w:color w:val="444444"/>
+                <w:sz w:val="18"/>
+                <w:szCs w:val="18"/>
+              </w:rPr>
+              <w:t xml:space="preserve">github.com/BOBMSH/Regime-Aware-Deep-Learning-for-Volatility-Forecasting-with-Uncertainty-Quantification — implementation, configurations, pinned dependencies and one script that regenerates every artefact in dependency order; Chapter 4 names the commit the reported values were produced from</w:t>
             </w:r>
           </w:p>
         </w:tc>

</xml_diff>